<commit_message>
resumes have been updated.
</commit_message>
<xml_diff>
--- a/resources/resumes/Tim-Presley-Resume-Head-of-UX.docx
+++ b/resources/resumes/Tim-Presley-Resume-Head-of-UX.docx
@@ -121,15 +121,7 @@
         <w:spacing w:after="60"/>
       </w:pPr>
       <w:r>
-        <w:t>UX Leadership &amp; Org Development • Talent Development &amp; Mentorship • UX Strategy &amp; Roadmap Influence • AI-Enabled Design Operations • Cross-Functional &amp; Executive Partnership • UX Research Methodology • Enterprise Design Systems • Design Governance • Accessibility (</w:t>
-      </w:r>
-      <w:proofErr w:type="gramStart"/>
-      <w:r>
-        <w:t>WCAG) •</w:t>
-      </w:r>
-      <w:proofErr w:type="gramEnd"/>
-      <w:r>
-        <w:t xml:space="preserve"> Agile / Lean Delivery</w:t>
+        <w:t>UX Leadership &amp; Org Development • Talent Development &amp; Mentorship • UX Strategy &amp; Roadmap Influence • AI-Enabled Design Operations • Cross-Functional &amp; Executive Partnership • UX Research Methodology • Enterprise Design Systems • Design Governance • Accessibility (WCAG) • Agile / Lean Delivery</w:t>
       </w:r>
     </w:p>
     <w:p>
@@ -174,52 +166,41 @@
           <w:i/>
           <w:iCs/>
         </w:rPr>
-        <w:t>Halliburton Sperry Drilling | Houston, TX | Oct 2024 - Present</w:t>
-      </w:r>
-    </w:p>
-    <w:p>
-      <w:pPr>
-        <w:pStyle w:val="ListParagraph"/>
-        <w:numPr>
-          <w:ilvl w:val="0"/>
-          <w:numId w:val="2"/>
-        </w:numPr>
-        <w:spacing w:after="35"/>
-      </w:pPr>
-      <w:r>
-        <w:t xml:space="preserve">Set UX direction and </w:t>
-      </w:r>
-      <w:proofErr w:type="gramStart"/>
-      <w:r>
-        <w:t>led</w:t>
-      </w:r>
-      <w:proofErr w:type="gramEnd"/>
-      <w:r>
-        <w:t xml:space="preserve"> a team of Lead and Principal designers across the Digital Drilling Portfolio, a global suite of real-time drilling and </w:t>
-      </w:r>
-      <w:proofErr w:type="spellStart"/>
-      <w:r>
-        <w:t>geosteering</w:t>
-      </w:r>
-      <w:proofErr w:type="spellEnd"/>
-      <w:r>
-        <w:t xml:space="preserve"> software (LOGIX, </w:t>
-      </w:r>
-      <w:proofErr w:type="spellStart"/>
-      <w:r>
-        <w:t>MaxReceiver</w:t>
-      </w:r>
-      <w:proofErr w:type="spellEnd"/>
-      <w:r>
-        <w:t xml:space="preserve">, RoxC, Auto </w:t>
-      </w:r>
-      <w:proofErr w:type="spellStart"/>
-      <w:r>
-        <w:t>Geosteering</w:t>
-      </w:r>
-      <w:proofErr w:type="spellEnd"/>
-      <w:r>
-        <w:t>, Design of Service) used in high-stakes field operations.</w:t>
+        <w:t xml:space="preserve">Halliburton Sperry Drilling | Houston, TX | Oct 2024 </w:t>
+      </w:r>
+      <w:r>
+        <w:rPr>
+          <w:i/>
+          <w:iCs/>
+        </w:rPr>
+        <w:t>–</w:t>
+      </w:r>
+      <w:r>
+        <w:rPr>
+          <w:i/>
+          <w:iCs/>
+        </w:rPr>
+        <w:t xml:space="preserve"> </w:t>
+      </w:r>
+      <w:r>
+        <w:rPr>
+          <w:i/>
+          <w:iCs/>
+        </w:rPr>
+        <w:t>Aug 2026</w:t>
+      </w:r>
+    </w:p>
+    <w:p>
+      <w:pPr>
+        <w:pStyle w:val="ListParagraph"/>
+        <w:numPr>
+          <w:ilvl w:val="0"/>
+          <w:numId w:val="2"/>
+        </w:numPr>
+        <w:spacing w:after="35"/>
+      </w:pPr>
+      <w:r>
+        <w:t>Set UX direction and led a team of Lead and Principal designers across the Digital Drilling Portfolio, a global suite of real-time drilling and geosteering software (LOGIX, MaxReceiver, RoxC, Auto Geosteering, Design of Service) used in high-stakes field operations.</w:t>
       </w:r>
     </w:p>
     <w:p>
@@ -258,15 +239,7 @@
         <w:spacing w:after="35"/>
       </w:pPr>
       <w:r>
-        <w:t xml:space="preserve">Brought AI into end-user products by leading design of AI-assisted features across the portfolio, including rig document loading and search, risk evaluation and outcome recommendations in Design of Service, and AI-assisted 2D and 3D model evaluation in RoxC and Auto </w:t>
-      </w:r>
-      <w:proofErr w:type="spellStart"/>
-      <w:r>
-        <w:t>Geosteering</w:t>
-      </w:r>
-      <w:proofErr w:type="spellEnd"/>
-      <w:r>
-        <w:t>.</w:t>
+        <w:t>Brought AI into end-user products by leading design of AI-assisted features across the portfolio, including rig document loading and search, risk evaluation and outcome recommendations in Design of Service, and AI-assisted 2D and 3D model evaluation in RoxC and Auto Geosteering.</w:t>
       </w:r>
     </w:p>
     <w:p>
@@ -453,15 +426,7 @@
         <w:spacing w:after="35"/>
       </w:pPr>
       <w:r>
-        <w:t xml:space="preserve">Delivered UX for Landmark’s </w:t>
-      </w:r>
-      <w:proofErr w:type="spellStart"/>
-      <w:r>
-        <w:t>DecisionSpace</w:t>
-      </w:r>
-      <w:proofErr w:type="spellEnd"/>
-      <w:r>
-        <w:t xml:space="preserve"> portfolio, including Agile Asset Management (AAM), Digital Well Program (DWP), Real-Time Well Engineering (RTWE), and geoscience/geophysics applications, enabling subsurface interpretation, well planning, and real-time drilling decisions.</w:t>
+        <w:t>Delivered UX for Landmark’s DecisionSpace portfolio, including Agile Asset Management (AAM), Digital Well Program (DWP), Real-Time Well Engineering (RTWE), and geoscience/geophysics applications, enabling subsurface interpretation, well planning, and real-time drilling decisions.</w:t>
       </w:r>
     </w:p>
     <w:p>
@@ -763,15 +728,7 @@
         <w:t xml:space="preserve">Design &amp; Collaboration: </w:t>
       </w:r>
       <w:r>
-        <w:t xml:space="preserve">Figma, </w:t>
-      </w:r>
-      <w:proofErr w:type="spellStart"/>
-      <w:r>
-        <w:t>FigJam</w:t>
-      </w:r>
-      <w:proofErr w:type="spellEnd"/>
-      <w:r>
-        <w:t>, Miro, Sketch, Adobe Creative Cloud</w:t>
+        <w:t>Figma, FigJam, Miro, Sketch, Adobe Creative Cloud</w:t>
       </w:r>
     </w:p>
     <w:p>
@@ -828,13 +785,8 @@
         <w:t xml:space="preserve">Methods: </w:t>
       </w:r>
       <w:r>
-        <w:t xml:space="preserve">Design Thinking, Lean UX, Systems Thinking, Jobs-to-be-Done, OKRs, </w:t>
-      </w:r>
-      <w:proofErr w:type="spellStart"/>
-      <w:r>
-        <w:t>DesignOps</w:t>
-      </w:r>
-      <w:proofErr w:type="spellEnd"/>
+        <w:t>Design Thinking, Lean UX, Systems Thinking, Jobs-to-be-Done, OKRs, DesignOps</w:t>
+      </w:r>
     </w:p>
     <w:sectPr>
       <w:pgSz w:w="12240" w:h="15840"/>

</xml_diff>